<commit_message>
FCT Configuration EntityFramework Packages et connexion
Installation des packages minimums pour EntityFramework et SQL Server et de la connexion à la BD.
</commit_message>
<xml_diff>
--- a/S04_Lab_Instructions.docx
+++ b/S04_Lab_Instructions.docx
@@ -1,6 +1,6 @@
 
 <file path=word/document.xml><?xml version="1.0" encoding="utf-8"?>
-<w:document xmlns:wpc="http://schemas.microsoft.com/office/word/2010/wordprocessingCanvas" xmlns:cx="http://schemas.microsoft.com/office/drawing/2014/chartex" xmlns:cx1="http://schemas.microsoft.com/office/drawing/2015/9/8/chartex" xmlns:cx2="http://schemas.microsoft.com/office/drawing/2015/10/21/chartex" xmlns:cx3="http://schemas.microsoft.com/office/drawing/2016/5/9/chartex" xmlns:cx4="http://schemas.microsoft.com/office/drawing/2016/5/10/chartex" xmlns:cx5="http://schemas.microsoft.com/office/drawing/2016/5/11/chartex" xmlns:cx6="http://schemas.microsoft.com/office/drawing/2016/5/12/chartex" xmlns:cx7="http://schemas.microsoft.com/office/drawing/2016/5/13/chartex" xmlns:cx8="http://schemas.microsoft.com/office/drawing/2016/5/14/chartex" xmlns:mc="http://schemas.openxmlformats.org/markup-compatibility/2006" xmlns:aink="http://schemas.microsoft.com/office/drawing/2016/ink" xmlns:am3d="http://schemas.microsoft.com/office/drawing/2017/model3d" xmlns:o="urn:schemas-microsoft-com:office:office" xmlns:oel="http://schemas.microsoft.com/office/2019/extlst" xmlns:r="http://schemas.openxmlformats.org/officeDocument/2006/relationships" xmlns:m="http://schemas.openxmlformats.org/officeDocument/2006/math" xmlns:v="urn:schemas-microsoft-com:vml" xmlns:wp14="http://schemas.microsoft.com/office/word/2010/wordprocessingDrawing" xmlns:wp="http://schemas.openxmlformats.org/drawingml/2006/wordprocessingDrawing" xmlns:w10="urn:schemas-microsoft-com:office:word" xmlns:w="http://schemas.openxmlformats.org/wordprocessingml/2006/main" xmlns:w14="http://schemas.microsoft.com/office/word/2010/wordml" xmlns:w15="http://schemas.microsoft.com/office/word/2012/wordml" xmlns:w16cex="http://schemas.microsoft.com/office/word/2018/wordml/cex" xmlns:w16cid="http://schemas.microsoft.com/office/word/2016/wordml/cid" xmlns:w16="http://schemas.microsoft.com/office/word/2018/wordml" xmlns:w16du="http://schemas.microsoft.com/office/word/2023/wordml/word16du" xmlns:w16sdtdh="http://schemas.microsoft.com/office/word/2020/wordml/sdtdatahash" xmlns:w16sdtfl="http://schemas.microsoft.com/office/word/2024/wordml/sdtformatlock" xmlns:w16se="http://schemas.microsoft.com/office/word/2015/wordml/symex" xmlns:wpg="http://schemas.microsoft.com/office/word/2010/wordprocessingGroup" xmlns:wpi="http://schemas.microsoft.com/office/word/2010/wordprocessingInk" xmlns:wne="http://schemas.microsoft.com/office/word/2006/wordml" xmlns:wps="http://schemas.microsoft.com/office/word/2010/wordprocessingShape" mc:Ignorable="w14 w15 w16se w16cid w16 w16cex w16sdtdh w16sdtfl w16du wp14">
+<w:document xmlns:wpc="http://schemas.microsoft.com/office/word/2010/wordprocessingCanvas" xmlns:cx="http://schemas.microsoft.com/office/drawing/2014/chartex" xmlns:cx1="http://schemas.microsoft.com/office/drawing/2015/9/8/chartex" xmlns:cx2="http://schemas.microsoft.com/office/drawing/2015/10/21/chartex" xmlns:cx3="http://schemas.microsoft.com/office/drawing/2016/5/9/chartex" xmlns:cx4="http://schemas.microsoft.com/office/drawing/2016/5/10/chartex" xmlns:cx5="http://schemas.microsoft.com/office/drawing/2016/5/11/chartex" xmlns:cx6="http://schemas.microsoft.com/office/drawing/2016/5/12/chartex" xmlns:cx7="http://schemas.microsoft.com/office/drawing/2016/5/13/chartex" xmlns:cx8="http://schemas.microsoft.com/office/drawing/2016/5/14/chartex" xmlns:mc="http://schemas.openxmlformats.org/markup-compatibility/2006" xmlns:aink="http://schemas.microsoft.com/office/drawing/2016/ink" xmlns:am3d="http://schemas.microsoft.com/office/drawing/2017/model3d" xmlns:o="urn:schemas-microsoft-com:office:office" xmlns:oel="http://schemas.microsoft.com/office/2019/extlst" xmlns:r="http://schemas.openxmlformats.org/officeDocument/2006/relationships" xmlns:m="http://schemas.openxmlformats.org/officeDocument/2006/math" xmlns:v="urn:schemas-microsoft-com:vml" xmlns:wp14="http://schemas.microsoft.com/office/word/2010/wordprocessingDrawing" xmlns:wp="http://schemas.openxmlformats.org/drawingml/2006/wordprocessingDrawing" xmlns:w10="urn:schemas-microsoft-com:office:word" xmlns:w="http://schemas.openxmlformats.org/wordprocessingml/2006/main" xmlns:w14="http://schemas.microsoft.com/office/word/2010/wordml" xmlns:w15="http://schemas.microsoft.com/office/word/2012/wordml" xmlns:w16cei="http://schemas.microsoft.com/office/word/2026/wordml/cei" xmlns:w16cex="http://schemas.microsoft.com/office/word/2018/wordml/cex" xmlns:w16cid="http://schemas.microsoft.com/office/word/2016/wordml/cid" xmlns:w16="http://schemas.microsoft.com/office/word/2018/wordml" xmlns:w16du="http://schemas.microsoft.com/office/word/2023/wordml/word16du" xmlns:w16sdtdh="http://schemas.microsoft.com/office/word/2020/wordml/sdtdatahash" xmlns:w16sdtfl="http://schemas.microsoft.com/office/word/2024/wordml/sdtformatlock" xmlns:w16se="http://schemas.microsoft.com/office/word/2015/wordml/symex" xmlns:wpg="http://schemas.microsoft.com/office/word/2010/wordprocessingGroup" xmlns:wpi="http://schemas.microsoft.com/office/word/2010/wordprocessingInk" xmlns:wne="http://schemas.microsoft.com/office/word/2006/wordml" xmlns:wps="http://schemas.microsoft.com/office/word/2010/wordprocessingShape" mc:Ignorable="w14 w15 w16se w16cid w16 w16cex w16sdtdh w16sdtfl w16du wp14">
   <w:background w:color="F2F2F2" w:themeColor="background1" w:themeShade="F2"/>
   <w:body>
     <w:p>
@@ -465,17 +465,32 @@
           <w:numId w:val="25"/>
         </w:numPr>
         <w:spacing w:before="0" w:after="160" w:line="259" w:lineRule="auto"/>
-      </w:pPr>
-      <w:r>
+        <w:rPr>
+          <w:highlight w:val="yellow"/>
+        </w:rPr>
+      </w:pPr>
+      <w:r>
+        <w:rPr>
+          <w:highlight w:val="yellow"/>
+        </w:rPr>
         <w:t xml:space="preserve">Ouvrez </w:t>
       </w:r>
       <w:r>
+        <w:rPr>
+          <w:highlight w:val="yellow"/>
+        </w:rPr>
         <w:t>l</w:t>
       </w:r>
       <w:r>
+        <w:rPr>
+          <w:highlight w:val="yellow"/>
+        </w:rPr>
         <w:t>e projet Visual Studio</w:t>
       </w:r>
       <w:r>
+        <w:rPr>
+          <w:highlight w:val="yellow"/>
+        </w:rPr>
         <w:t xml:space="preserve"> qui se trouve dans votre dossier cloné</w:t>
       </w:r>
     </w:p>
@@ -487,11 +502,20 @@
           <w:numId w:val="25"/>
         </w:numPr>
         <w:spacing w:before="0" w:after="160" w:line="259" w:lineRule="auto"/>
-      </w:pPr>
-      <w:r>
+        <w:rPr>
+          <w:highlight w:val="yellow"/>
+        </w:rPr>
+      </w:pPr>
+      <w:r>
+        <w:rPr>
+          <w:highlight w:val="yellow"/>
+        </w:rPr>
         <w:t>Allez dans Outils-Gestionnaire de packages N</w:t>
       </w:r>
       <w:r>
+        <w:rPr>
+          <w:highlight w:val="yellow"/>
+        </w:rPr>
         <w:t>uGet-Gérer les packages de la solution</w:t>
       </w:r>
     </w:p>
@@ -503,25 +527,46 @@
           <w:numId w:val="25"/>
         </w:numPr>
         <w:spacing w:before="0" w:after="160" w:line="259" w:lineRule="auto"/>
-      </w:pPr>
-      <w:r>
+        <w:rPr>
+          <w:highlight w:val="yellow"/>
+        </w:rPr>
+      </w:pPr>
+      <w:r>
+        <w:rPr>
+          <w:highlight w:val="yellow"/>
+        </w:rPr>
         <w:t xml:space="preserve">Installer les </w:t>
       </w:r>
       <w:proofErr w:type="gramStart"/>
       <w:r>
+        <w:rPr>
+          <w:highlight w:val="yellow"/>
+        </w:rPr>
         <w:t>packages</w:t>
       </w:r>
       <w:proofErr w:type="gramEnd"/>
       <w:r>
+        <w:rPr>
+          <w:highlight w:val="yellow"/>
+        </w:rPr>
         <w:t xml:space="preserve"> suivants</w:t>
       </w:r>
       <w:r>
+        <w:rPr>
+          <w:highlight w:val="yellow"/>
+        </w:rPr>
         <w:t>, acceptez les licences et confirmez l'installation</w:t>
       </w:r>
       <w:r>
+        <w:rPr>
+          <w:highlight w:val="yellow"/>
+        </w:rPr>
         <w:t xml:space="preserve"> (messages)</w:t>
       </w:r>
       <w:r>
+        <w:rPr>
+          <w:highlight w:val="yellow"/>
+        </w:rPr>
         <w:t>:</w:t>
       </w:r>
     </w:p>
@@ -539,6 +584,7 @@
           <w:color w:val="000000"/>
           <w:sz w:val="19"/>
           <w:szCs w:val="19"/>
+          <w:highlight w:val="yellow"/>
         </w:rPr>
       </w:pPr>
       <w:proofErr w:type="spellStart"/>
@@ -548,6 +594,7 @@
           <w:color w:val="000000"/>
           <w:sz w:val="19"/>
           <w:szCs w:val="19"/>
+          <w:highlight w:val="yellow"/>
         </w:rPr>
         <w:t>Microsoft.EntityFrameworkCore</w:t>
       </w:r>
@@ -558,6 +605,7 @@
           <w:color w:val="000000"/>
           <w:sz w:val="19"/>
           <w:szCs w:val="19"/>
+          <w:highlight w:val="yellow"/>
         </w:rPr>
         <w:t xml:space="preserve"> </w:t>
       </w:r>
@@ -567,6 +615,7 @@
           <w:color w:val="000000"/>
           <w:sz w:val="19"/>
           <w:szCs w:val="19"/>
+          <w:highlight w:val="yellow"/>
         </w:rPr>
         <w:t>8</w:t>
       </w:r>
@@ -576,6 +625,7 @@
           <w:color w:val="000000"/>
           <w:sz w:val="19"/>
           <w:szCs w:val="19"/>
+          <w:highlight w:val="yellow"/>
         </w:rPr>
         <w:t>.0.</w:t>
       </w:r>
@@ -585,6 +635,7 @@
           <w:color w:val="000000"/>
           <w:sz w:val="19"/>
           <w:szCs w:val="19"/>
+          <w:highlight w:val="yellow"/>
         </w:rPr>
         <w:t>28</w:t>
       </w:r>
@@ -602,6 +653,7 @@
           <w:color w:val="000000"/>
           <w:sz w:val="19"/>
           <w:szCs w:val="19"/>
+          <w:highlight w:val="yellow"/>
         </w:rPr>
       </w:pPr>
       <w:proofErr w:type="spellStart"/>
@@ -612,6 +664,7 @@
           <w:color w:val="000000"/>
           <w:sz w:val="19"/>
           <w:szCs w:val="19"/>
+          <w:highlight w:val="yellow"/>
         </w:rPr>
         <w:t>Microsoft.EntityFrameworkCore.SqlServer</w:t>
       </w:r>
@@ -623,6 +676,7 @@
           <w:color w:val="000000"/>
           <w:sz w:val="19"/>
           <w:szCs w:val="19"/>
+          <w:highlight w:val="yellow"/>
         </w:rPr>
         <w:t xml:space="preserve"> </w:t>
       </w:r>
@@ -632,6 +686,7 @@
           <w:color w:val="000000"/>
           <w:sz w:val="19"/>
           <w:szCs w:val="19"/>
+          <w:highlight w:val="yellow"/>
         </w:rPr>
         <w:t>8</w:t>
       </w:r>
@@ -641,6 +696,7 @@
           <w:color w:val="000000"/>
           <w:sz w:val="19"/>
           <w:szCs w:val="19"/>
+          <w:highlight w:val="yellow"/>
         </w:rPr>
         <w:t>.0.</w:t>
       </w:r>
@@ -650,6 +706,7 @@
           <w:color w:val="000000"/>
           <w:sz w:val="19"/>
           <w:szCs w:val="19"/>
+          <w:highlight w:val="yellow"/>
         </w:rPr>
         <w:t>28</w:t>
       </w:r>
@@ -662,10 +719,16 @@
         </w:numPr>
         <w:spacing w:before="0" w:after="100" w:afterAutospacing="1" w:line="240" w:lineRule="auto"/>
         <w:ind w:left="1423" w:hanging="357"/>
+        <w:rPr>
+          <w:highlight w:val="yellow"/>
+        </w:rPr>
       </w:pPr>
       <w:proofErr w:type="spellStart"/>
       <w:proofErr w:type="gramStart"/>
       <w:r>
+        <w:rPr>
+          <w:highlight w:val="yellow"/>
+        </w:rPr>
         <w:t>Microsoft.EntityFrameworkCore.tools</w:t>
       </w:r>
       <w:proofErr w:type="spellEnd"/>
@@ -676,6 +739,7 @@
           <w:color w:val="000000"/>
           <w:sz w:val="19"/>
           <w:szCs w:val="19"/>
+          <w:highlight w:val="yellow"/>
         </w:rPr>
         <w:t xml:space="preserve"> </w:t>
       </w:r>
@@ -685,6 +749,7 @@
           <w:color w:val="000000"/>
           <w:sz w:val="19"/>
           <w:szCs w:val="19"/>
+          <w:highlight w:val="yellow"/>
         </w:rPr>
         <w:t>8</w:t>
       </w:r>
@@ -694,6 +759,7 @@
           <w:color w:val="000000"/>
           <w:sz w:val="19"/>
           <w:szCs w:val="19"/>
+          <w:highlight w:val="yellow"/>
         </w:rPr>
         <w:t>.0.</w:t>
       </w:r>
@@ -703,6 +769,7 @@
           <w:color w:val="000000"/>
           <w:sz w:val="19"/>
           <w:szCs w:val="19"/>
+          <w:highlight w:val="yellow"/>
         </w:rPr>
         <w:t>28</w:t>
       </w:r>
@@ -716,6 +783,7 @@
         <w:spacing w:before="0" w:after="100" w:afterAutospacing="1" w:line="240" w:lineRule="auto"/>
         <w:ind w:left="1423" w:hanging="357"/>
         <w:rPr>
+          <w:highlight w:val="yellow"/>
           <w:lang w:val="en-CA"/>
         </w:rPr>
       </w:pPr>
@@ -723,6 +791,7 @@
       <w:proofErr w:type="gramStart"/>
       <w:r>
         <w:rPr>
+          <w:highlight w:val="yellow"/>
           <w:lang w:val="en-CA"/>
         </w:rPr>
         <w:t>Microsoft.VisualStudio.Web.CodeGeneration</w:t>
@@ -730,6 +799,7 @@
       <w:proofErr w:type="gramEnd"/>
       <w:r>
         <w:rPr>
+          <w:highlight w:val="yellow"/>
           <w:lang w:val="en-CA"/>
         </w:rPr>
         <w:t>.Design</w:t>
@@ -741,6 +811,7 @@
           <w:color w:val="000000"/>
           <w:sz w:val="19"/>
           <w:szCs w:val="19"/>
+          <w:highlight w:val="yellow"/>
           <w:lang w:val="en-CA"/>
         </w:rPr>
         <w:t xml:space="preserve"> </w:t>
@@ -753,6 +824,7 @@
           <w:color w:val="000000"/>
           <w:sz w:val="19"/>
           <w:szCs w:val="19"/>
+          <w:highlight w:val="yellow"/>
           <w:lang w:val="en-CA"/>
         </w:rPr>
         <w:t>8</w:t>
@@ -765,6 +837,7 @@
           <w:color w:val="000000"/>
           <w:sz w:val="19"/>
           <w:szCs w:val="19"/>
+          <w:highlight w:val="yellow"/>
           <w:lang w:val="en-CA"/>
         </w:rPr>
         <w:t>.0.</w:t>
@@ -777,6 +850,7 @@
           <w:color w:val="000000"/>
           <w:sz w:val="19"/>
           <w:szCs w:val="19"/>
+          <w:highlight w:val="yellow"/>
           <w:lang w:val="en-CA"/>
         </w:rPr>
         <w:t>23</w:t>
@@ -827,8 +901,14 @@
     <w:p>
       <w:pPr>
         <w:pStyle w:val="Titre2"/>
-      </w:pPr>
-      <w:r>
+        <w:rPr>
+          <w:highlight w:val="yellow"/>
+        </w:rPr>
+      </w:pPr>
+      <w:r>
+        <w:rPr>
+          <w:highlight w:val="yellow"/>
+        </w:rPr>
         <w:t>Ajout de la Connexion à la DB</w:t>
       </w:r>
     </w:p>
@@ -840,12 +920,21 @@
           <w:numId w:val="7"/>
         </w:numPr>
         <w:spacing w:before="0" w:after="160" w:line="259" w:lineRule="auto"/>
-      </w:pPr>
-      <w:r>
+        <w:rPr>
+          <w:highlight w:val="yellow"/>
+        </w:rPr>
+      </w:pPr>
+      <w:r>
+        <w:rPr>
+          <w:highlight w:val="yellow"/>
+        </w:rPr>
         <w:t xml:space="preserve">Ouvrez le fichier </w:t>
       </w:r>
       <w:proofErr w:type="spellStart"/>
       <w:r>
+        <w:rPr>
+          <w:highlight w:val="yellow"/>
+        </w:rPr>
         <w:t>appSettings.json</w:t>
       </w:r>
       <w:proofErr w:type="spellEnd"/>
@@ -858,12 +947,15 @@
           <w:numId w:val="7"/>
         </w:numPr>
         <w:spacing w:before="0" w:after="160" w:line="259" w:lineRule="auto"/>
-      </w:pPr>
-      <w:r>
-        <w:t>Ajouter la connexion soit l</w:t>
-      </w:r>
-      <w:r>
-        <w:t>e texte en vert ATTENTION n'oubliez pas la virgule!</w:t>
+        <w:rPr>
+          <w:highlight w:val="yellow"/>
+        </w:rPr>
+      </w:pPr>
+      <w:r>
+        <w:rPr>
+          <w:highlight w:val="yellow"/>
+        </w:rPr>
+        <w:t>Ajouter la connexion soit le texte en vert ATTENTION n'oubliez pas la virgule!</w:t>
       </w:r>
     </w:p>
     <w:p>
@@ -1869,39 +1961,54 @@
           <w:numId w:val="7"/>
         </w:numPr>
         <w:spacing w:after="160" w:line="259" w:lineRule="auto"/>
-      </w:pPr>
-      <w:r>
-        <w:t xml:space="preserve">La valeur </w:t>
-      </w:r>
-      <w:r>
-        <w:t>(</w:t>
-      </w:r>
-      <w:proofErr w:type="spellStart"/>
-      <w:r>
+        <w:rPr>
+          <w:highlight w:val="yellow"/>
+        </w:rPr>
+      </w:pPr>
+      <w:r>
+        <w:rPr>
+          <w:highlight w:val="yellow"/>
+        </w:rPr>
+        <w:t>La valeur (</w:t>
+      </w:r>
+      <w:proofErr w:type="spellStart"/>
+      <w:r>
+        <w:rPr>
+          <w:highlight w:val="yellow"/>
+        </w:rPr>
         <w:t>localdb</w:t>
       </w:r>
       <w:proofErr w:type="spellEnd"/>
       <w:r>
-        <w:t>)</w:t>
-      </w:r>
-      <w:r>
-        <w:t>\\</w:t>
-      </w:r>
-      <w:proofErr w:type="spellStart"/>
-      <w:r>
+        <w:rPr>
+          <w:highlight w:val="yellow"/>
+        </w:rPr>
+        <w:t>)\\</w:t>
+      </w:r>
+      <w:proofErr w:type="spellStart"/>
+      <w:r>
+        <w:rPr>
+          <w:highlight w:val="yellow"/>
+        </w:rPr>
         <w:t>mssqllocaldb</w:t>
       </w:r>
       <w:proofErr w:type="spellEnd"/>
       <w:r>
-        <w:t xml:space="preserve"> p</w:t>
-      </w:r>
-      <w:r>
-        <w:t>our Server peut changer si vous travaillez à la maison. Il faut mettre le nom du serveur de BD install</w:t>
-      </w:r>
-      <w:r>
+        <w:rPr>
+          <w:highlight w:val="yellow"/>
+        </w:rPr>
+        <w:t xml:space="preserve"> pour Server peut changer si vous travaillez à la maison. Il faut mettre le nom du serveur de BD install</w:t>
+      </w:r>
+      <w:r>
+        <w:rPr>
+          <w:highlight w:val="yellow"/>
+        </w:rPr>
         <w:t>é</w:t>
       </w:r>
       <w:r>
+        <w:rPr>
+          <w:highlight w:val="yellow"/>
+        </w:rPr>
         <w:t xml:space="preserve"> sur votre machine.</w:t>
       </w:r>
     </w:p>
@@ -2773,21 +2880,8 @@
           <w:highlight w:val="green"/>
           <w:lang w:val="en-CA"/>
         </w:rPr>
-        <w:t>&lt;</w:t>
-      </w:r>
-      <w:proofErr w:type="spellStart"/>
-      <w:r>
-        <w:rPr>
-          <w:rFonts w:ascii="Cascadia Mono" w:hAnsi="Cascadia Mono" w:cs="Cascadia Mono"/>
-          <w:color w:val="000000"/>
-          <w:sz w:val="19"/>
-          <w:szCs w:val="19"/>
-          <w:highlight w:val="green"/>
-          <w:lang w:val="en-CA"/>
-        </w:rPr>
-        <w:t>ZombiePartyDbContext</w:t>
-      </w:r>
-      <w:proofErr w:type="spellEnd"/>
+        <w:t>&lt;ZombiePartyDbContext</w:t>
+      </w:r>
       <w:proofErr w:type="gramStart"/>
       <w:r>
         <w:rPr>
@@ -5062,7 +5156,15 @@
         <w:spacing w:before="0" w:after="160" w:line="259" w:lineRule="auto"/>
       </w:pPr>
       <w:r>
-        <w:t xml:space="preserve">Et si vous avez ce message à la place, c’est que vous avez mis les annotations sur ZombieType et non </w:t>
+        <w:t xml:space="preserve">Et si vous avez ce message à la place, c’est que vous avez mis les annotations sur </w:t>
+      </w:r>
+      <w:proofErr w:type="spellStart"/>
+      <w:r>
+        <w:t>ZombieType</w:t>
+      </w:r>
+      <w:proofErr w:type="spellEnd"/>
+      <w:r>
+        <w:t xml:space="preserve"> et non </w:t>
       </w:r>
       <w:proofErr w:type="spellStart"/>
       <w:r>
@@ -9349,7 +9451,6 @@
         </w:rPr>
         <w:t xml:space="preserve"> </w:t>
       </w:r>
-      <w:proofErr w:type="spellStart"/>
       <w:r>
         <w:rPr>
           <w:rFonts w:ascii="Cascadia Mono" w:hAnsi="Cascadia Mono" w:cs="Cascadia Mono"/>
@@ -9361,7 +9462,6 @@
         </w:rPr>
         <w:t>ZombiePartyDbContext</w:t>
       </w:r>
-      <w:proofErr w:type="spellEnd"/>
       <w:r>
         <w:rPr>
           <w:rFonts w:ascii="Cascadia Mono" w:hAnsi="Cascadia Mono" w:cs="Cascadia Mono"/>
@@ -9779,20 +9879,38 @@
           <w:bCs/>
         </w:rPr>
       </w:pPr>
+      <w:proofErr w:type="spellStart"/>
       <w:r>
         <w:rPr>
           <w:b/>
           <w:bCs/>
         </w:rPr>
         <w:lastRenderedPageBreak/>
-        <w:t xml:space="preserve">ZombieType </w:t>
-      </w:r>
+        <w:t>ZombieType</w:t>
+      </w:r>
+      <w:proofErr w:type="spellEnd"/>
       <w:r>
         <w:rPr>
           <w:b/>
           <w:bCs/>
         </w:rPr>
-        <w:t xml:space="preserve">Views </w:t>
+        <w:t xml:space="preserve"> </w:t>
+      </w:r>
+      <w:proofErr w:type="spellStart"/>
+      <w:r>
+        <w:rPr>
+          <w:b/>
+          <w:bCs/>
+        </w:rPr>
+        <w:t>Views</w:t>
+      </w:r>
+      <w:proofErr w:type="spellEnd"/>
+      <w:r>
+        <w:rPr>
+          <w:b/>
+          <w:bCs/>
+        </w:rPr>
+        <w:t xml:space="preserve"> </w:t>
       </w:r>
       <w:proofErr w:type="spellStart"/>
       <w:r>
@@ -9820,7 +9938,15 @@
         </w:numPr>
       </w:pPr>
       <w:r>
-        <w:t xml:space="preserve">Ouvrez la View </w:t>
+        <w:t xml:space="preserve">Ouvrez la </w:t>
+      </w:r>
+      <w:proofErr w:type="spellStart"/>
+      <w:r>
+        <w:t>View</w:t>
+      </w:r>
+      <w:proofErr w:type="spellEnd"/>
+      <w:r>
+        <w:t xml:space="preserve"> </w:t>
       </w:r>
       <w:proofErr w:type="spellStart"/>
       <w:r>
@@ -12138,7 +12264,15 @@
         <w:t xml:space="preserve">En cas de doute, référez-vous </w:t>
       </w:r>
       <w:r>
-        <w:t xml:space="preserve">au ZombieType ou au </w:t>
+        <w:t xml:space="preserve">au </w:t>
+      </w:r>
+      <w:proofErr w:type="spellStart"/>
+      <w:r>
+        <w:t>ZombieType</w:t>
+      </w:r>
+      <w:proofErr w:type="spellEnd"/>
+      <w:r>
+        <w:t xml:space="preserve"> ou au </w:t>
       </w:r>
       <w:proofErr w:type="spellStart"/>
       <w:r>
@@ -12422,6 +12556,7 @@
           <w:color w:val="000000"/>
           <w:sz w:val="19"/>
           <w:szCs w:val="19"/>
+          <w:lang w:val="en-CA"/>
         </w:rPr>
       </w:pPr>
       <w:r>
@@ -12433,15 +12568,68 @@
         </w:rPr>
         <w:t xml:space="preserve">    </w:t>
       </w:r>
+      <w:r>
+        <w:rPr>
+          <w:rFonts w:ascii="Cascadia Mono" w:hAnsi="Cascadia Mono" w:cs="Cascadia Mono"/>
+          <w:color w:val="0000FF"/>
+          <w:sz w:val="19"/>
+          <w:szCs w:val="19"/>
+          <w:lang w:val="en-CA"/>
+        </w:rPr>
+        <w:t>public</w:t>
+      </w:r>
+      <w:r>
+        <w:rPr>
+          <w:rFonts w:ascii="Cascadia Mono" w:hAnsi="Cascadia Mono" w:cs="Cascadia Mono"/>
+          <w:color w:val="000000"/>
+          <w:sz w:val="19"/>
+          <w:szCs w:val="19"/>
+          <w:lang w:val="en-CA"/>
+        </w:rPr>
+        <w:t xml:space="preserve"> Zombie </w:t>
+      </w:r>
+      <w:proofErr w:type="spellStart"/>
+      <w:r>
+        <w:rPr>
+          <w:rFonts w:ascii="Cascadia Mono" w:hAnsi="Cascadia Mono" w:cs="Cascadia Mono"/>
+          <w:color w:val="000000"/>
+          <w:sz w:val="19"/>
+          <w:szCs w:val="19"/>
+          <w:lang w:val="en-CA"/>
+        </w:rPr>
+        <w:t>Zombie</w:t>
+      </w:r>
+      <w:proofErr w:type="spellEnd"/>
+      <w:r>
+        <w:rPr>
+          <w:rFonts w:ascii="Cascadia Mono" w:hAnsi="Cascadia Mono" w:cs="Cascadia Mono"/>
+          <w:color w:val="000000"/>
+          <w:sz w:val="19"/>
+          <w:szCs w:val="19"/>
+          <w:lang w:val="en-CA"/>
+        </w:rPr>
+        <w:t xml:space="preserve"> </w:t>
+      </w:r>
       <w:proofErr w:type="gramStart"/>
       <w:r>
         <w:rPr>
           <w:rFonts w:ascii="Cascadia Mono" w:hAnsi="Cascadia Mono" w:cs="Cascadia Mono"/>
+          <w:color w:val="000000"/>
+          <w:sz w:val="19"/>
+          <w:szCs w:val="19"/>
+          <w:lang w:val="en-CA"/>
+        </w:rPr>
+        <w:t xml:space="preserve">{ </w:t>
+      </w:r>
+      <w:r>
+        <w:rPr>
+          <w:rFonts w:ascii="Cascadia Mono" w:hAnsi="Cascadia Mono" w:cs="Cascadia Mono"/>
           <w:color w:val="0000FF"/>
           <w:sz w:val="19"/>
           <w:szCs w:val="19"/>
-        </w:rPr>
-        <w:t>public</w:t>
+          <w:lang w:val="en-CA"/>
+        </w:rPr>
+        <w:t>get</w:t>
       </w:r>
       <w:proofErr w:type="gramEnd"/>
       <w:r>
@@ -12450,28 +12638,19 @@
           <w:color w:val="000000"/>
           <w:sz w:val="19"/>
           <w:szCs w:val="19"/>
-        </w:rPr>
-        <w:t xml:space="preserve"> Zombie </w:t>
-      </w:r>
-      <w:proofErr w:type="spellStart"/>
-      <w:r>
-        <w:rPr>
-          <w:rFonts w:ascii="Cascadia Mono" w:hAnsi="Cascadia Mono" w:cs="Cascadia Mono"/>
-          <w:color w:val="000000"/>
-          <w:sz w:val="19"/>
-          <w:szCs w:val="19"/>
-        </w:rPr>
-        <w:t>Zombie</w:t>
-      </w:r>
-      <w:proofErr w:type="spellEnd"/>
-      <w:r>
-        <w:rPr>
-          <w:rFonts w:ascii="Cascadia Mono" w:hAnsi="Cascadia Mono" w:cs="Cascadia Mono"/>
-          <w:color w:val="000000"/>
-          <w:sz w:val="19"/>
-          <w:szCs w:val="19"/>
-        </w:rPr>
-        <w:t xml:space="preserve"> </w:t>
+          <w:lang w:val="en-CA"/>
+        </w:rPr>
+        <w:t xml:space="preserve">; </w:t>
+      </w:r>
+      <w:r>
+        <w:rPr>
+          <w:rFonts w:ascii="Cascadia Mono" w:hAnsi="Cascadia Mono" w:cs="Cascadia Mono"/>
+          <w:color w:val="0000FF"/>
+          <w:sz w:val="19"/>
+          <w:szCs w:val="19"/>
+          <w:lang w:val="en-CA"/>
+        </w:rPr>
+        <w:t>set</w:t>
       </w:r>
       <w:proofErr w:type="gramStart"/>
       <w:r>
@@ -12480,46 +12659,7 @@
           <w:color w:val="000000"/>
           <w:sz w:val="19"/>
           <w:szCs w:val="19"/>
-        </w:rPr>
-        <w:t xml:space="preserve">{ </w:t>
-      </w:r>
-      <w:proofErr w:type="spellStart"/>
-      <w:r>
-        <w:rPr>
-          <w:rFonts w:ascii="Cascadia Mono" w:hAnsi="Cascadia Mono" w:cs="Cascadia Mono"/>
-          <w:color w:val="0000FF"/>
-          <w:sz w:val="19"/>
-          <w:szCs w:val="19"/>
-        </w:rPr>
-        <w:t>get</w:t>
-      </w:r>
-      <w:proofErr w:type="spellEnd"/>
-      <w:proofErr w:type="gramEnd"/>
-      <w:r>
-        <w:rPr>
-          <w:rFonts w:ascii="Cascadia Mono" w:hAnsi="Cascadia Mono" w:cs="Cascadia Mono"/>
-          <w:color w:val="000000"/>
-          <w:sz w:val="19"/>
-          <w:szCs w:val="19"/>
-        </w:rPr>
-        <w:t xml:space="preserve">; </w:t>
-      </w:r>
-      <w:r>
-        <w:rPr>
-          <w:rFonts w:ascii="Cascadia Mono" w:hAnsi="Cascadia Mono" w:cs="Cascadia Mono"/>
-          <w:color w:val="0000FF"/>
-          <w:sz w:val="19"/>
-          <w:szCs w:val="19"/>
-        </w:rPr>
-        <w:t>set</w:t>
-      </w:r>
-      <w:proofErr w:type="gramStart"/>
-      <w:r>
-        <w:rPr>
-          <w:rFonts w:ascii="Cascadia Mono" w:hAnsi="Cascadia Mono" w:cs="Cascadia Mono"/>
-          <w:color w:val="000000"/>
-          <w:sz w:val="19"/>
-          <w:szCs w:val="19"/>
+          <w:lang w:val="en-CA"/>
         </w:rPr>
         <w:t>; }</w:t>
       </w:r>
@@ -12544,6 +12684,7 @@
           <w:color w:val="000000"/>
           <w:sz w:val="19"/>
           <w:szCs w:val="19"/>
+          <w:lang w:val="en-CA"/>
         </w:rPr>
       </w:pPr>
     </w:p>
@@ -12566,14 +12707,16 @@
           <w:color w:val="000000"/>
           <w:sz w:val="19"/>
           <w:szCs w:val="19"/>
-        </w:rPr>
-      </w:pPr>
-      <w:r>
-        <w:rPr>
-          <w:rFonts w:ascii="Cascadia Mono" w:hAnsi="Cascadia Mono" w:cs="Cascadia Mono"/>
-          <w:color w:val="000000"/>
-          <w:sz w:val="19"/>
-          <w:szCs w:val="19"/>
+          <w:lang w:val="en-CA"/>
+        </w:rPr>
+      </w:pPr>
+      <w:r>
+        <w:rPr>
+          <w:rFonts w:ascii="Cascadia Mono" w:hAnsi="Cascadia Mono" w:cs="Cascadia Mono"/>
+          <w:color w:val="000000"/>
+          <w:sz w:val="19"/>
+          <w:szCs w:val="19"/>
+          <w:lang w:val="en-CA"/>
         </w:rPr>
         <w:t xml:space="preserve">    </w:t>
       </w:r>
@@ -13362,7 +13505,29 @@
           <w:szCs w:val="19"/>
           <w:highlight w:val="cyan"/>
         </w:rPr>
-        <w:t xml:space="preserve"> View(</w:t>
+        <w:t xml:space="preserve"> </w:t>
+      </w:r>
+      <w:proofErr w:type="spellStart"/>
+      <w:r>
+        <w:rPr>
+          <w:rFonts w:ascii="Cascadia Mono" w:hAnsi="Cascadia Mono" w:cs="Cascadia Mono"/>
+          <w:color w:val="000000"/>
+          <w:sz w:val="19"/>
+          <w:szCs w:val="19"/>
+          <w:highlight w:val="cyan"/>
+        </w:rPr>
+        <w:t>View</w:t>
+      </w:r>
+      <w:proofErr w:type="spellEnd"/>
+      <w:r>
+        <w:rPr>
+          <w:rFonts w:ascii="Cascadia Mono" w:hAnsi="Cascadia Mono" w:cs="Cascadia Mono"/>
+          <w:color w:val="000000"/>
+          <w:sz w:val="19"/>
+          <w:szCs w:val="19"/>
+          <w:highlight w:val="cyan"/>
+        </w:rPr>
+        <w:t>(</w:t>
       </w:r>
       <w:proofErr w:type="spellStart"/>
       <w:r>
@@ -14135,27 +14300,7 @@
           <w:sz w:val="19"/>
           <w:szCs w:val="19"/>
         </w:rPr>
-        <w:t xml:space="preserve"> </w:t>
-      </w:r>
-      <w:proofErr w:type="spellStart"/>
-      <w:r>
-        <w:rPr>
-          <w:rFonts w:ascii="Cascadia Mono" w:hAnsi="Cascadia Mono" w:cs="Cascadia Mono"/>
-          <w:color w:val="A31515"/>
-          <w:sz w:val="19"/>
-          <w:szCs w:val="19"/>
-        </w:rPr>
-        <w:t>added</w:t>
-      </w:r>
-      <w:proofErr w:type="spellEnd"/>
-      <w:r>
-        <w:rPr>
-          <w:rFonts w:ascii="Cascadia Mono" w:hAnsi="Cascadia Mono" w:cs="Cascadia Mono"/>
-          <w:color w:val="A31515"/>
-          <w:sz w:val="19"/>
-          <w:szCs w:val="19"/>
-        </w:rPr>
-        <w:t>"</w:t>
+        <w:t xml:space="preserve"> added"</w:t>
       </w:r>
       <w:r>
         <w:rPr>
@@ -14466,7 +14611,29 @@
           <w:szCs w:val="19"/>
           <w:highlight w:val="magenta"/>
         </w:rPr>
-        <w:t xml:space="preserve">    ZombieType </w:t>
+        <w:t xml:space="preserve">    </w:t>
+      </w:r>
+      <w:proofErr w:type="spellStart"/>
+      <w:r>
+        <w:rPr>
+          <w:rFonts w:ascii="Cascadia Mono" w:hAnsi="Cascadia Mono" w:cs="Cascadia Mono"/>
+          <w:color w:val="000000"/>
+          <w:sz w:val="19"/>
+          <w:szCs w:val="19"/>
+          <w:highlight w:val="magenta"/>
+        </w:rPr>
+        <w:t>ZombieType</w:t>
+      </w:r>
+      <w:proofErr w:type="spellEnd"/>
+      <w:r>
+        <w:rPr>
+          <w:rFonts w:ascii="Cascadia Mono" w:hAnsi="Cascadia Mono" w:cs="Cascadia Mono"/>
+          <w:color w:val="000000"/>
+          <w:sz w:val="19"/>
+          <w:szCs w:val="19"/>
+          <w:highlight w:val="magenta"/>
+        </w:rPr>
+        <w:t xml:space="preserve"> </w:t>
       </w:r>
       <w:proofErr w:type="spellStart"/>
       <w:r>
@@ -15064,6 +15231,7 @@
         </w:rPr>
         <w:t xml:space="preserve"> </w:t>
       </w:r>
+      <w:proofErr w:type="spellStart"/>
       <w:proofErr w:type="gramStart"/>
       <w:r>
         <w:rPr>
@@ -15072,7 +15240,17 @@
           <w:sz w:val="19"/>
           <w:szCs w:val="19"/>
         </w:rPr>
-        <w:t>View(</w:t>
+        <w:t>View</w:t>
+      </w:r>
+      <w:proofErr w:type="spellEnd"/>
+      <w:r>
+        <w:rPr>
+          <w:rFonts w:ascii="Cascadia Mono" w:hAnsi="Cascadia Mono" w:cs="Cascadia Mono"/>
+          <w:color w:val="000000"/>
+          <w:sz w:val="19"/>
+          <w:szCs w:val="19"/>
+        </w:rPr>
+        <w:t>(</w:t>
       </w:r>
       <w:proofErr w:type="gramEnd"/>
       <w:r>
@@ -19449,7 +19627,7 @@
 </file>
 
 <file path=word/endnotes.xml><?xml version="1.0" encoding="utf-8"?>
-<w:endnotes xmlns:wpc="http://schemas.microsoft.com/office/word/2010/wordprocessingCanvas" xmlns:cx="http://schemas.microsoft.com/office/drawing/2014/chartex" xmlns:cx1="http://schemas.microsoft.com/office/drawing/2015/9/8/chartex" xmlns:cx2="http://schemas.microsoft.com/office/drawing/2015/10/21/chartex" xmlns:cx3="http://schemas.microsoft.com/office/drawing/2016/5/9/chartex" xmlns:cx4="http://schemas.microsoft.com/office/drawing/2016/5/10/chartex" xmlns:cx5="http://schemas.microsoft.com/office/drawing/2016/5/11/chartex" xmlns:cx6="http://schemas.microsoft.com/office/drawing/2016/5/12/chartex" xmlns:cx7="http://schemas.microsoft.com/office/drawing/2016/5/13/chartex" xmlns:cx8="http://schemas.microsoft.com/office/drawing/2016/5/14/chartex" xmlns:mc="http://schemas.openxmlformats.org/markup-compatibility/2006" xmlns:aink="http://schemas.microsoft.com/office/drawing/2016/ink" xmlns:am3d="http://schemas.microsoft.com/office/drawing/2017/model3d" xmlns:o="urn:schemas-microsoft-com:office:office" xmlns:oel="http://schemas.microsoft.com/office/2019/extlst" xmlns:r="http://schemas.openxmlformats.org/officeDocument/2006/relationships" xmlns:m="http://schemas.openxmlformats.org/officeDocument/2006/math" xmlns:v="urn:schemas-microsoft-com:vml" xmlns:wp14="http://schemas.microsoft.com/office/word/2010/wordprocessingDrawing" xmlns:wp="http://schemas.openxmlformats.org/drawingml/2006/wordprocessingDrawing" xmlns:w10="urn:schemas-microsoft-com:office:word" xmlns:w="http://schemas.openxmlformats.org/wordprocessingml/2006/main" xmlns:w14="http://schemas.microsoft.com/office/word/2010/wordml" xmlns:w15="http://schemas.microsoft.com/office/word/2012/wordml" xmlns:w16cex="http://schemas.microsoft.com/office/word/2018/wordml/cex" xmlns:w16cid="http://schemas.microsoft.com/office/word/2016/wordml/cid" xmlns:w16="http://schemas.microsoft.com/office/word/2018/wordml" xmlns:w16du="http://schemas.microsoft.com/office/word/2023/wordml/word16du" xmlns:w16sdtdh="http://schemas.microsoft.com/office/word/2020/wordml/sdtdatahash" xmlns:w16sdtfl="http://schemas.microsoft.com/office/word/2024/wordml/sdtformatlock" xmlns:w16se="http://schemas.microsoft.com/office/word/2015/wordml/symex" xmlns:wpg="http://schemas.microsoft.com/office/word/2010/wordprocessingGroup" xmlns:wpi="http://schemas.microsoft.com/office/word/2010/wordprocessingInk" xmlns:wne="http://schemas.microsoft.com/office/word/2006/wordml" xmlns:wps="http://schemas.microsoft.com/office/word/2010/wordprocessingShape" mc:Ignorable="w14 w15 w16se w16cid w16 w16cex w16sdtdh w16sdtfl w16du wp14">
+<w:endnotes xmlns:wpc="http://schemas.microsoft.com/office/word/2010/wordprocessingCanvas" xmlns:cx="http://schemas.microsoft.com/office/drawing/2014/chartex" xmlns:cx1="http://schemas.microsoft.com/office/drawing/2015/9/8/chartex" xmlns:cx2="http://schemas.microsoft.com/office/drawing/2015/10/21/chartex" xmlns:cx3="http://schemas.microsoft.com/office/drawing/2016/5/9/chartex" xmlns:cx4="http://schemas.microsoft.com/office/drawing/2016/5/10/chartex" xmlns:cx5="http://schemas.microsoft.com/office/drawing/2016/5/11/chartex" xmlns:cx6="http://schemas.microsoft.com/office/drawing/2016/5/12/chartex" xmlns:cx7="http://schemas.microsoft.com/office/drawing/2016/5/13/chartex" xmlns:cx8="http://schemas.microsoft.com/office/drawing/2016/5/14/chartex" xmlns:mc="http://schemas.openxmlformats.org/markup-compatibility/2006" xmlns:aink="http://schemas.microsoft.com/office/drawing/2016/ink" xmlns:am3d="http://schemas.microsoft.com/office/drawing/2017/model3d" xmlns:o="urn:schemas-microsoft-com:office:office" xmlns:oel="http://schemas.microsoft.com/office/2019/extlst" xmlns:r="http://schemas.openxmlformats.org/officeDocument/2006/relationships" xmlns:m="http://schemas.openxmlformats.org/officeDocument/2006/math" xmlns:v="urn:schemas-microsoft-com:vml" xmlns:wp14="http://schemas.microsoft.com/office/word/2010/wordprocessingDrawing" xmlns:wp="http://schemas.openxmlformats.org/drawingml/2006/wordprocessingDrawing" xmlns:w10="urn:schemas-microsoft-com:office:word" xmlns:w="http://schemas.openxmlformats.org/wordprocessingml/2006/main" xmlns:w14="http://schemas.microsoft.com/office/word/2010/wordml" xmlns:w15="http://schemas.microsoft.com/office/word/2012/wordml" xmlns:w16cei="http://schemas.microsoft.com/office/word/2026/wordml/cei" xmlns:w16cex="http://schemas.microsoft.com/office/word/2018/wordml/cex" xmlns:w16cid="http://schemas.microsoft.com/office/word/2016/wordml/cid" xmlns:w16="http://schemas.microsoft.com/office/word/2018/wordml" xmlns:w16du="http://schemas.microsoft.com/office/word/2023/wordml/word16du" xmlns:w16sdtdh="http://schemas.microsoft.com/office/word/2020/wordml/sdtdatahash" xmlns:w16sdtfl="http://schemas.microsoft.com/office/word/2024/wordml/sdtformatlock" xmlns:w16se="http://schemas.microsoft.com/office/word/2015/wordml/symex" xmlns:wpg="http://schemas.microsoft.com/office/word/2010/wordprocessingGroup" xmlns:wpi="http://schemas.microsoft.com/office/word/2010/wordprocessingInk" xmlns:wne="http://schemas.microsoft.com/office/word/2006/wordml" xmlns:wps="http://schemas.microsoft.com/office/word/2010/wordprocessingShape" mc:Ignorable="w14 w15 w16se w16cid w16 w16cex w16sdtdh w16sdtfl w16du wp14">
   <w:endnote w:type="separator" w:id="-1">
     <w:p>
       <w:r>
@@ -19468,7 +19646,7 @@
 </file>
 
 <file path=word/footer1.xml><?xml version="1.0" encoding="utf-8"?>
-<w:ftr xmlns:wpc="http://schemas.microsoft.com/office/word/2010/wordprocessingCanvas" xmlns:cx="http://schemas.microsoft.com/office/drawing/2014/chartex" xmlns:cx1="http://schemas.microsoft.com/office/drawing/2015/9/8/chartex" xmlns:cx2="http://schemas.microsoft.com/office/drawing/2015/10/21/chartex" xmlns:cx3="http://schemas.microsoft.com/office/drawing/2016/5/9/chartex" xmlns:cx4="http://schemas.microsoft.com/office/drawing/2016/5/10/chartex" xmlns:cx5="http://schemas.microsoft.com/office/drawing/2016/5/11/chartex" xmlns:cx6="http://schemas.microsoft.com/office/drawing/2016/5/12/chartex" xmlns:cx7="http://schemas.microsoft.com/office/drawing/2016/5/13/chartex" xmlns:cx8="http://schemas.microsoft.com/office/drawing/2016/5/14/chartex" xmlns:mc="http://schemas.openxmlformats.org/markup-compatibility/2006" xmlns:aink="http://schemas.microsoft.com/office/drawing/2016/ink" xmlns:am3d="http://schemas.microsoft.com/office/drawing/2017/model3d" xmlns:o="urn:schemas-microsoft-com:office:office" xmlns:oel="http://schemas.microsoft.com/office/2019/extlst" xmlns:r="http://schemas.openxmlformats.org/officeDocument/2006/relationships" xmlns:m="http://schemas.openxmlformats.org/officeDocument/2006/math" xmlns:v="urn:schemas-microsoft-com:vml" xmlns:wp14="http://schemas.microsoft.com/office/word/2010/wordprocessingDrawing" xmlns:wp="http://schemas.openxmlformats.org/drawingml/2006/wordprocessingDrawing" xmlns:w10="urn:schemas-microsoft-com:office:word" xmlns:w="http://schemas.openxmlformats.org/wordprocessingml/2006/main" xmlns:w14="http://schemas.microsoft.com/office/word/2010/wordml" xmlns:w15="http://schemas.microsoft.com/office/word/2012/wordml" xmlns:w16cex="http://schemas.microsoft.com/office/word/2018/wordml/cex" xmlns:w16cid="http://schemas.microsoft.com/office/word/2016/wordml/cid" xmlns:w16="http://schemas.microsoft.com/office/word/2018/wordml" xmlns:w16du="http://schemas.microsoft.com/office/word/2023/wordml/word16du" xmlns:w16sdtdh="http://schemas.microsoft.com/office/word/2020/wordml/sdtdatahash" xmlns:w16sdtfl="http://schemas.microsoft.com/office/word/2024/wordml/sdtformatlock" xmlns:w16se="http://schemas.microsoft.com/office/word/2015/wordml/symex" xmlns:wpg="http://schemas.microsoft.com/office/word/2010/wordprocessingGroup" xmlns:wpi="http://schemas.microsoft.com/office/word/2010/wordprocessingInk" xmlns:wne="http://schemas.microsoft.com/office/word/2006/wordml" xmlns:wps="http://schemas.microsoft.com/office/word/2010/wordprocessingShape" mc:Ignorable="w14 w15 w16se w16cid w16 w16cex w16sdtdh w16sdtfl w16du wp14">
+<w:ftr xmlns:wpc="http://schemas.microsoft.com/office/word/2010/wordprocessingCanvas" xmlns:cx="http://schemas.microsoft.com/office/drawing/2014/chartex" xmlns:cx1="http://schemas.microsoft.com/office/drawing/2015/9/8/chartex" xmlns:cx2="http://schemas.microsoft.com/office/drawing/2015/10/21/chartex" xmlns:cx3="http://schemas.microsoft.com/office/drawing/2016/5/9/chartex" xmlns:cx4="http://schemas.microsoft.com/office/drawing/2016/5/10/chartex" xmlns:cx5="http://schemas.microsoft.com/office/drawing/2016/5/11/chartex" xmlns:cx6="http://schemas.microsoft.com/office/drawing/2016/5/12/chartex" xmlns:cx7="http://schemas.microsoft.com/office/drawing/2016/5/13/chartex" xmlns:cx8="http://schemas.microsoft.com/office/drawing/2016/5/14/chartex" xmlns:mc="http://schemas.openxmlformats.org/markup-compatibility/2006" xmlns:aink="http://schemas.microsoft.com/office/drawing/2016/ink" xmlns:am3d="http://schemas.microsoft.com/office/drawing/2017/model3d" xmlns:o="urn:schemas-microsoft-com:office:office" xmlns:oel="http://schemas.microsoft.com/office/2019/extlst" xmlns:r="http://schemas.openxmlformats.org/officeDocument/2006/relationships" xmlns:m="http://schemas.openxmlformats.org/officeDocument/2006/math" xmlns:v="urn:schemas-microsoft-com:vml" xmlns:wp14="http://schemas.microsoft.com/office/word/2010/wordprocessingDrawing" xmlns:wp="http://schemas.openxmlformats.org/drawingml/2006/wordprocessingDrawing" xmlns:w10="urn:schemas-microsoft-com:office:word" xmlns:w="http://schemas.openxmlformats.org/wordprocessingml/2006/main" xmlns:w14="http://schemas.microsoft.com/office/word/2010/wordml" xmlns:w15="http://schemas.microsoft.com/office/word/2012/wordml" xmlns:w16cei="http://schemas.microsoft.com/office/word/2026/wordml/cei" xmlns:w16cex="http://schemas.microsoft.com/office/word/2018/wordml/cex" xmlns:w16cid="http://schemas.microsoft.com/office/word/2016/wordml/cid" xmlns:w16="http://schemas.microsoft.com/office/word/2018/wordml" xmlns:w16du="http://schemas.microsoft.com/office/word/2023/wordml/word16du" xmlns:w16sdtdh="http://schemas.microsoft.com/office/word/2020/wordml/sdtdatahash" xmlns:w16sdtfl="http://schemas.microsoft.com/office/word/2024/wordml/sdtformatlock" xmlns:w16se="http://schemas.microsoft.com/office/word/2015/wordml/symex" xmlns:wpg="http://schemas.microsoft.com/office/word/2010/wordprocessingGroup" xmlns:wpi="http://schemas.microsoft.com/office/word/2010/wordprocessingInk" xmlns:wne="http://schemas.microsoft.com/office/word/2006/wordml" xmlns:wps="http://schemas.microsoft.com/office/word/2010/wordprocessingShape" mc:Ignorable="w14 w15 w16se w16cid w16 w16cex w16sdtdh w16sdtfl w16du wp14">
   <w:p>
     <w:pPr>
       <w:pStyle w:val="Pieddepage"/>
@@ -19478,7 +19656,7 @@
 </file>
 
 <file path=word/footer2.xml><?xml version="1.0" encoding="utf-8"?>
-<w:ftr xmlns:wpc="http://schemas.microsoft.com/office/word/2010/wordprocessingCanvas" xmlns:cx="http://schemas.microsoft.com/office/drawing/2014/chartex" xmlns:cx1="http://schemas.microsoft.com/office/drawing/2015/9/8/chartex" xmlns:cx2="http://schemas.microsoft.com/office/drawing/2015/10/21/chartex" xmlns:cx3="http://schemas.microsoft.com/office/drawing/2016/5/9/chartex" xmlns:cx4="http://schemas.microsoft.com/office/drawing/2016/5/10/chartex" xmlns:cx5="http://schemas.microsoft.com/office/drawing/2016/5/11/chartex" xmlns:cx6="http://schemas.microsoft.com/office/drawing/2016/5/12/chartex" xmlns:cx7="http://schemas.microsoft.com/office/drawing/2016/5/13/chartex" xmlns:cx8="http://schemas.microsoft.com/office/drawing/2016/5/14/chartex" xmlns:mc="http://schemas.openxmlformats.org/markup-compatibility/2006" xmlns:aink="http://schemas.microsoft.com/office/drawing/2016/ink" xmlns:am3d="http://schemas.microsoft.com/office/drawing/2017/model3d" xmlns:o="urn:schemas-microsoft-com:office:office" xmlns:oel="http://schemas.microsoft.com/office/2019/extlst" xmlns:r="http://schemas.openxmlformats.org/officeDocument/2006/relationships" xmlns:m="http://schemas.openxmlformats.org/officeDocument/2006/math" xmlns:v="urn:schemas-microsoft-com:vml" xmlns:wp14="http://schemas.microsoft.com/office/word/2010/wordprocessingDrawing" xmlns:wp="http://schemas.openxmlformats.org/drawingml/2006/wordprocessingDrawing" xmlns:w10="urn:schemas-microsoft-com:office:word" xmlns:w="http://schemas.openxmlformats.org/wordprocessingml/2006/main" xmlns:w14="http://schemas.microsoft.com/office/word/2010/wordml" xmlns:w15="http://schemas.microsoft.com/office/word/2012/wordml" xmlns:w16cex="http://schemas.microsoft.com/office/word/2018/wordml/cex" xmlns:w16cid="http://schemas.microsoft.com/office/word/2016/wordml/cid" xmlns:w16="http://schemas.microsoft.com/office/word/2018/wordml" xmlns:w16du="http://schemas.microsoft.com/office/word/2023/wordml/word16du" xmlns:w16sdtdh="http://schemas.microsoft.com/office/word/2020/wordml/sdtdatahash" xmlns:w16sdtfl="http://schemas.microsoft.com/office/word/2024/wordml/sdtformatlock" xmlns:w16se="http://schemas.microsoft.com/office/word/2015/wordml/symex" xmlns:wpg="http://schemas.microsoft.com/office/word/2010/wordprocessingGroup" xmlns:wpi="http://schemas.microsoft.com/office/word/2010/wordprocessingInk" xmlns:wne="http://schemas.microsoft.com/office/word/2006/wordml" xmlns:wps="http://schemas.microsoft.com/office/word/2010/wordprocessingShape" mc:Ignorable="w14 w15 w16se w16cid w16 w16cex w16sdtdh w16sdtfl w16du wp14">
+<w:ftr xmlns:wpc="http://schemas.microsoft.com/office/word/2010/wordprocessingCanvas" xmlns:cx="http://schemas.microsoft.com/office/drawing/2014/chartex" xmlns:cx1="http://schemas.microsoft.com/office/drawing/2015/9/8/chartex" xmlns:cx2="http://schemas.microsoft.com/office/drawing/2015/10/21/chartex" xmlns:cx3="http://schemas.microsoft.com/office/drawing/2016/5/9/chartex" xmlns:cx4="http://schemas.microsoft.com/office/drawing/2016/5/10/chartex" xmlns:cx5="http://schemas.microsoft.com/office/drawing/2016/5/11/chartex" xmlns:cx6="http://schemas.microsoft.com/office/drawing/2016/5/12/chartex" xmlns:cx7="http://schemas.microsoft.com/office/drawing/2016/5/13/chartex" xmlns:cx8="http://schemas.microsoft.com/office/drawing/2016/5/14/chartex" xmlns:mc="http://schemas.openxmlformats.org/markup-compatibility/2006" xmlns:aink="http://schemas.microsoft.com/office/drawing/2016/ink" xmlns:am3d="http://schemas.microsoft.com/office/drawing/2017/model3d" xmlns:o="urn:schemas-microsoft-com:office:office" xmlns:oel="http://schemas.microsoft.com/office/2019/extlst" xmlns:r="http://schemas.openxmlformats.org/officeDocument/2006/relationships" xmlns:m="http://schemas.openxmlformats.org/officeDocument/2006/math" xmlns:v="urn:schemas-microsoft-com:vml" xmlns:wp14="http://schemas.microsoft.com/office/word/2010/wordprocessingDrawing" xmlns:wp="http://schemas.openxmlformats.org/drawingml/2006/wordprocessingDrawing" xmlns:w10="urn:schemas-microsoft-com:office:word" xmlns:w="http://schemas.openxmlformats.org/wordprocessingml/2006/main" xmlns:w14="http://schemas.microsoft.com/office/word/2010/wordml" xmlns:w15="http://schemas.microsoft.com/office/word/2012/wordml" xmlns:w16cei="http://schemas.microsoft.com/office/word/2026/wordml/cei" xmlns:w16cex="http://schemas.microsoft.com/office/word/2018/wordml/cex" xmlns:w16cid="http://schemas.microsoft.com/office/word/2016/wordml/cid" xmlns:w16="http://schemas.microsoft.com/office/word/2018/wordml" xmlns:w16du="http://schemas.microsoft.com/office/word/2023/wordml/word16du" xmlns:w16sdtdh="http://schemas.microsoft.com/office/word/2020/wordml/sdtdatahash" xmlns:w16sdtfl="http://schemas.microsoft.com/office/word/2024/wordml/sdtformatlock" xmlns:w16se="http://schemas.microsoft.com/office/word/2015/wordml/symex" xmlns:wpg="http://schemas.microsoft.com/office/word/2010/wordprocessingGroup" xmlns:wpi="http://schemas.microsoft.com/office/word/2010/wordprocessingInk" xmlns:wne="http://schemas.microsoft.com/office/word/2006/wordml" xmlns:wps="http://schemas.microsoft.com/office/word/2010/wordprocessingShape" mc:Ignorable="w14 w15 w16se w16cid w16 w16cex w16sdtdh w16sdtfl w16du wp14">
   <w:p>
     <w:pPr>
       <w:pStyle w:val="Pieddepage"/>
@@ -19531,7 +19709,7 @@
 </file>
 
 <file path=word/footer3.xml><?xml version="1.0" encoding="utf-8"?>
-<w:ftr xmlns:wpc="http://schemas.microsoft.com/office/word/2010/wordprocessingCanvas" xmlns:cx="http://schemas.microsoft.com/office/drawing/2014/chartex" xmlns:cx1="http://schemas.microsoft.com/office/drawing/2015/9/8/chartex" xmlns:cx2="http://schemas.microsoft.com/office/drawing/2015/10/21/chartex" xmlns:cx3="http://schemas.microsoft.com/office/drawing/2016/5/9/chartex" xmlns:cx4="http://schemas.microsoft.com/office/drawing/2016/5/10/chartex" xmlns:cx5="http://schemas.microsoft.com/office/drawing/2016/5/11/chartex" xmlns:cx6="http://schemas.microsoft.com/office/drawing/2016/5/12/chartex" xmlns:cx7="http://schemas.microsoft.com/office/drawing/2016/5/13/chartex" xmlns:cx8="http://schemas.microsoft.com/office/drawing/2016/5/14/chartex" xmlns:mc="http://schemas.openxmlformats.org/markup-compatibility/2006" xmlns:aink="http://schemas.microsoft.com/office/drawing/2016/ink" xmlns:am3d="http://schemas.microsoft.com/office/drawing/2017/model3d" xmlns:o="urn:schemas-microsoft-com:office:office" xmlns:oel="http://schemas.microsoft.com/office/2019/extlst" xmlns:r="http://schemas.openxmlformats.org/officeDocument/2006/relationships" xmlns:m="http://schemas.openxmlformats.org/officeDocument/2006/math" xmlns:v="urn:schemas-microsoft-com:vml" xmlns:wp14="http://schemas.microsoft.com/office/word/2010/wordprocessingDrawing" xmlns:wp="http://schemas.openxmlformats.org/drawingml/2006/wordprocessingDrawing" xmlns:w10="urn:schemas-microsoft-com:office:word" xmlns:w="http://schemas.openxmlformats.org/wordprocessingml/2006/main" xmlns:w14="http://schemas.microsoft.com/office/word/2010/wordml" xmlns:w15="http://schemas.microsoft.com/office/word/2012/wordml" xmlns:w16cex="http://schemas.microsoft.com/office/word/2018/wordml/cex" xmlns:w16cid="http://schemas.microsoft.com/office/word/2016/wordml/cid" xmlns:w16="http://schemas.microsoft.com/office/word/2018/wordml" xmlns:w16du="http://schemas.microsoft.com/office/word/2023/wordml/word16du" xmlns:w16sdtdh="http://schemas.microsoft.com/office/word/2020/wordml/sdtdatahash" xmlns:w16sdtfl="http://schemas.microsoft.com/office/word/2024/wordml/sdtformatlock" xmlns:w16se="http://schemas.microsoft.com/office/word/2015/wordml/symex" xmlns:wpg="http://schemas.microsoft.com/office/word/2010/wordprocessingGroup" xmlns:wpi="http://schemas.microsoft.com/office/word/2010/wordprocessingInk" xmlns:wne="http://schemas.microsoft.com/office/word/2006/wordml" xmlns:wps="http://schemas.microsoft.com/office/word/2010/wordprocessingShape" mc:Ignorable="w14 w15 w16se w16cid w16 w16cex w16sdtdh w16sdtfl w16du wp14">
+<w:ftr xmlns:wpc="http://schemas.microsoft.com/office/word/2010/wordprocessingCanvas" xmlns:cx="http://schemas.microsoft.com/office/drawing/2014/chartex" xmlns:cx1="http://schemas.microsoft.com/office/drawing/2015/9/8/chartex" xmlns:cx2="http://schemas.microsoft.com/office/drawing/2015/10/21/chartex" xmlns:cx3="http://schemas.microsoft.com/office/drawing/2016/5/9/chartex" xmlns:cx4="http://schemas.microsoft.com/office/drawing/2016/5/10/chartex" xmlns:cx5="http://schemas.microsoft.com/office/drawing/2016/5/11/chartex" xmlns:cx6="http://schemas.microsoft.com/office/drawing/2016/5/12/chartex" xmlns:cx7="http://schemas.microsoft.com/office/drawing/2016/5/13/chartex" xmlns:cx8="http://schemas.microsoft.com/office/drawing/2016/5/14/chartex" xmlns:mc="http://schemas.openxmlformats.org/markup-compatibility/2006" xmlns:aink="http://schemas.microsoft.com/office/drawing/2016/ink" xmlns:am3d="http://schemas.microsoft.com/office/drawing/2017/model3d" xmlns:o="urn:schemas-microsoft-com:office:office" xmlns:oel="http://schemas.microsoft.com/office/2019/extlst" xmlns:r="http://schemas.openxmlformats.org/officeDocument/2006/relationships" xmlns:m="http://schemas.openxmlformats.org/officeDocument/2006/math" xmlns:v="urn:schemas-microsoft-com:vml" xmlns:wp14="http://schemas.microsoft.com/office/word/2010/wordprocessingDrawing" xmlns:wp="http://schemas.openxmlformats.org/drawingml/2006/wordprocessingDrawing" xmlns:w10="urn:schemas-microsoft-com:office:word" xmlns:w="http://schemas.openxmlformats.org/wordprocessingml/2006/main" xmlns:w14="http://schemas.microsoft.com/office/word/2010/wordml" xmlns:w15="http://schemas.microsoft.com/office/word/2012/wordml" xmlns:w16cei="http://schemas.microsoft.com/office/word/2026/wordml/cei" xmlns:w16cex="http://schemas.microsoft.com/office/word/2018/wordml/cex" xmlns:w16cid="http://schemas.microsoft.com/office/word/2016/wordml/cid" xmlns:w16="http://schemas.microsoft.com/office/word/2018/wordml" xmlns:w16du="http://schemas.microsoft.com/office/word/2023/wordml/word16du" xmlns:w16sdtdh="http://schemas.microsoft.com/office/word/2020/wordml/sdtdatahash" xmlns:w16sdtfl="http://schemas.microsoft.com/office/word/2024/wordml/sdtformatlock" xmlns:w16se="http://schemas.microsoft.com/office/word/2015/wordml/symex" xmlns:wpg="http://schemas.microsoft.com/office/word/2010/wordprocessingGroup" xmlns:wpi="http://schemas.microsoft.com/office/word/2010/wordprocessingInk" xmlns:wne="http://schemas.microsoft.com/office/word/2006/wordml" xmlns:wps="http://schemas.microsoft.com/office/word/2010/wordprocessingShape" mc:Ignorable="w14 w15 w16se w16cid w16 w16cex w16sdtdh w16sdtfl w16du wp14">
   <w:p>
     <w:pPr>
       <w:pStyle w:val="Pieddepage"/>
@@ -19541,7 +19719,7 @@
 </file>
 
 <file path=word/footnotes.xml><?xml version="1.0" encoding="utf-8"?>
-<w:footnotes xmlns:wpc="http://schemas.microsoft.com/office/word/2010/wordprocessingCanvas" xmlns:cx="http://schemas.microsoft.com/office/drawing/2014/chartex" xmlns:cx1="http://schemas.microsoft.com/office/drawing/2015/9/8/chartex" xmlns:cx2="http://schemas.microsoft.com/office/drawing/2015/10/21/chartex" xmlns:cx3="http://schemas.microsoft.com/office/drawing/2016/5/9/chartex" xmlns:cx4="http://schemas.microsoft.com/office/drawing/2016/5/10/chartex" xmlns:cx5="http://schemas.microsoft.com/office/drawing/2016/5/11/chartex" xmlns:cx6="http://schemas.microsoft.com/office/drawing/2016/5/12/chartex" xmlns:cx7="http://schemas.microsoft.com/office/drawing/2016/5/13/chartex" xmlns:cx8="http://schemas.microsoft.com/office/drawing/2016/5/14/chartex" xmlns:mc="http://schemas.openxmlformats.org/markup-compatibility/2006" xmlns:aink="http://schemas.microsoft.com/office/drawing/2016/ink" xmlns:am3d="http://schemas.microsoft.com/office/drawing/2017/model3d" xmlns:o="urn:schemas-microsoft-com:office:office" xmlns:oel="http://schemas.microsoft.com/office/2019/extlst" xmlns:r="http://schemas.openxmlformats.org/officeDocument/2006/relationships" xmlns:m="http://schemas.openxmlformats.org/officeDocument/2006/math" xmlns:v="urn:schemas-microsoft-com:vml" xmlns:wp14="http://schemas.microsoft.com/office/word/2010/wordprocessingDrawing" xmlns:wp="http://schemas.openxmlformats.org/drawingml/2006/wordprocessingDrawing" xmlns:w10="urn:schemas-microsoft-com:office:word" xmlns:w="http://schemas.openxmlformats.org/wordprocessingml/2006/main" xmlns:w14="http://schemas.microsoft.com/office/word/2010/wordml" xmlns:w15="http://schemas.microsoft.com/office/word/2012/wordml" xmlns:w16cex="http://schemas.microsoft.com/office/word/2018/wordml/cex" xmlns:w16cid="http://schemas.microsoft.com/office/word/2016/wordml/cid" xmlns:w16="http://schemas.microsoft.com/office/word/2018/wordml" xmlns:w16du="http://schemas.microsoft.com/office/word/2023/wordml/word16du" xmlns:w16sdtdh="http://schemas.microsoft.com/office/word/2020/wordml/sdtdatahash" xmlns:w16sdtfl="http://schemas.microsoft.com/office/word/2024/wordml/sdtformatlock" xmlns:w16se="http://schemas.microsoft.com/office/word/2015/wordml/symex" xmlns:wpg="http://schemas.microsoft.com/office/word/2010/wordprocessingGroup" xmlns:wpi="http://schemas.microsoft.com/office/word/2010/wordprocessingInk" xmlns:wne="http://schemas.microsoft.com/office/word/2006/wordml" xmlns:wps="http://schemas.microsoft.com/office/word/2010/wordprocessingShape" mc:Ignorable="w14 w15 w16se w16cid w16 w16cex w16sdtdh w16sdtfl w16du wp14">
+<w:footnotes xmlns:wpc="http://schemas.microsoft.com/office/word/2010/wordprocessingCanvas" xmlns:cx="http://schemas.microsoft.com/office/drawing/2014/chartex" xmlns:cx1="http://schemas.microsoft.com/office/drawing/2015/9/8/chartex" xmlns:cx2="http://schemas.microsoft.com/office/drawing/2015/10/21/chartex" xmlns:cx3="http://schemas.microsoft.com/office/drawing/2016/5/9/chartex" xmlns:cx4="http://schemas.microsoft.com/office/drawing/2016/5/10/chartex" xmlns:cx5="http://schemas.microsoft.com/office/drawing/2016/5/11/chartex" xmlns:cx6="http://schemas.microsoft.com/office/drawing/2016/5/12/chartex" xmlns:cx7="http://schemas.microsoft.com/office/drawing/2016/5/13/chartex" xmlns:cx8="http://schemas.microsoft.com/office/drawing/2016/5/14/chartex" xmlns:mc="http://schemas.openxmlformats.org/markup-compatibility/2006" xmlns:aink="http://schemas.microsoft.com/office/drawing/2016/ink" xmlns:am3d="http://schemas.microsoft.com/office/drawing/2017/model3d" xmlns:o="urn:schemas-microsoft-com:office:office" xmlns:oel="http://schemas.microsoft.com/office/2019/extlst" xmlns:r="http://schemas.openxmlformats.org/officeDocument/2006/relationships" xmlns:m="http://schemas.openxmlformats.org/officeDocument/2006/math" xmlns:v="urn:schemas-microsoft-com:vml" xmlns:wp14="http://schemas.microsoft.com/office/word/2010/wordprocessingDrawing" xmlns:wp="http://schemas.openxmlformats.org/drawingml/2006/wordprocessingDrawing" xmlns:w10="urn:schemas-microsoft-com:office:word" xmlns:w="http://schemas.openxmlformats.org/wordprocessingml/2006/main" xmlns:w14="http://schemas.microsoft.com/office/word/2010/wordml" xmlns:w15="http://schemas.microsoft.com/office/word/2012/wordml" xmlns:w16cei="http://schemas.microsoft.com/office/word/2026/wordml/cei" xmlns:w16cex="http://schemas.microsoft.com/office/word/2018/wordml/cex" xmlns:w16cid="http://schemas.microsoft.com/office/word/2016/wordml/cid" xmlns:w16="http://schemas.microsoft.com/office/word/2018/wordml" xmlns:w16du="http://schemas.microsoft.com/office/word/2023/wordml/word16du" xmlns:w16sdtdh="http://schemas.microsoft.com/office/word/2020/wordml/sdtdatahash" xmlns:w16sdtfl="http://schemas.microsoft.com/office/word/2024/wordml/sdtformatlock" xmlns:w16se="http://schemas.microsoft.com/office/word/2015/wordml/symex" xmlns:wpg="http://schemas.microsoft.com/office/word/2010/wordprocessingGroup" xmlns:wpi="http://schemas.microsoft.com/office/word/2010/wordprocessingInk" xmlns:wne="http://schemas.microsoft.com/office/word/2006/wordml" xmlns:wps="http://schemas.microsoft.com/office/word/2010/wordprocessingShape" mc:Ignorable="w14 w15 w16se w16cid w16 w16cex w16sdtdh w16sdtfl w16du wp14">
   <w:footnote w:type="separator" w:id="-1">
     <w:p>
       <w:r>
@@ -19560,7 +19738,7 @@
 </file>
 
 <file path=word/header1.xml><?xml version="1.0" encoding="utf-8"?>
-<w:hdr xmlns:wpc="http://schemas.microsoft.com/office/word/2010/wordprocessingCanvas" xmlns:cx="http://schemas.microsoft.com/office/drawing/2014/chartex" xmlns:cx1="http://schemas.microsoft.com/office/drawing/2015/9/8/chartex" xmlns:cx2="http://schemas.microsoft.com/office/drawing/2015/10/21/chartex" xmlns:cx3="http://schemas.microsoft.com/office/drawing/2016/5/9/chartex" xmlns:cx4="http://schemas.microsoft.com/office/drawing/2016/5/10/chartex" xmlns:cx5="http://schemas.microsoft.com/office/drawing/2016/5/11/chartex" xmlns:cx6="http://schemas.microsoft.com/office/drawing/2016/5/12/chartex" xmlns:cx7="http://schemas.microsoft.com/office/drawing/2016/5/13/chartex" xmlns:cx8="http://schemas.microsoft.com/office/drawing/2016/5/14/chartex" xmlns:mc="http://schemas.openxmlformats.org/markup-compatibility/2006" xmlns:aink="http://schemas.microsoft.com/office/drawing/2016/ink" xmlns:am3d="http://schemas.microsoft.com/office/drawing/2017/model3d" xmlns:o="urn:schemas-microsoft-com:office:office" xmlns:oel="http://schemas.microsoft.com/office/2019/extlst" xmlns:r="http://schemas.openxmlformats.org/officeDocument/2006/relationships" xmlns:m="http://schemas.openxmlformats.org/officeDocument/2006/math" xmlns:v="urn:schemas-microsoft-com:vml" xmlns:wp14="http://schemas.microsoft.com/office/word/2010/wordprocessingDrawing" xmlns:wp="http://schemas.openxmlformats.org/drawingml/2006/wordprocessingDrawing" xmlns:w10="urn:schemas-microsoft-com:office:word" xmlns:w="http://schemas.openxmlformats.org/wordprocessingml/2006/main" xmlns:w14="http://schemas.microsoft.com/office/word/2010/wordml" xmlns:w15="http://schemas.microsoft.com/office/word/2012/wordml" xmlns:w16cex="http://schemas.microsoft.com/office/word/2018/wordml/cex" xmlns:w16cid="http://schemas.microsoft.com/office/word/2016/wordml/cid" xmlns:w16="http://schemas.microsoft.com/office/word/2018/wordml" xmlns:w16du="http://schemas.microsoft.com/office/word/2023/wordml/word16du" xmlns:w16sdtdh="http://schemas.microsoft.com/office/word/2020/wordml/sdtdatahash" xmlns:w16sdtfl="http://schemas.microsoft.com/office/word/2024/wordml/sdtformatlock" xmlns:w16se="http://schemas.microsoft.com/office/word/2015/wordml/symex" xmlns:wpg="http://schemas.microsoft.com/office/word/2010/wordprocessingGroup" xmlns:wpi="http://schemas.microsoft.com/office/word/2010/wordprocessingInk" xmlns:wne="http://schemas.microsoft.com/office/word/2006/wordml" xmlns:wps="http://schemas.microsoft.com/office/word/2010/wordprocessingShape" mc:Ignorable="w14 w15 w16se w16cid w16 w16cex w16sdtdh w16sdtfl w16du wp14">
+<w:hdr xmlns:wpc="http://schemas.microsoft.com/office/word/2010/wordprocessingCanvas" xmlns:cx="http://schemas.microsoft.com/office/drawing/2014/chartex" xmlns:cx1="http://schemas.microsoft.com/office/drawing/2015/9/8/chartex" xmlns:cx2="http://schemas.microsoft.com/office/drawing/2015/10/21/chartex" xmlns:cx3="http://schemas.microsoft.com/office/drawing/2016/5/9/chartex" xmlns:cx4="http://schemas.microsoft.com/office/drawing/2016/5/10/chartex" xmlns:cx5="http://schemas.microsoft.com/office/drawing/2016/5/11/chartex" xmlns:cx6="http://schemas.microsoft.com/office/drawing/2016/5/12/chartex" xmlns:cx7="http://schemas.microsoft.com/office/drawing/2016/5/13/chartex" xmlns:cx8="http://schemas.microsoft.com/office/drawing/2016/5/14/chartex" xmlns:mc="http://schemas.openxmlformats.org/markup-compatibility/2006" xmlns:aink="http://schemas.microsoft.com/office/drawing/2016/ink" xmlns:am3d="http://schemas.microsoft.com/office/drawing/2017/model3d" xmlns:o="urn:schemas-microsoft-com:office:office" xmlns:oel="http://schemas.microsoft.com/office/2019/extlst" xmlns:r="http://schemas.openxmlformats.org/officeDocument/2006/relationships" xmlns:m="http://schemas.openxmlformats.org/officeDocument/2006/math" xmlns:v="urn:schemas-microsoft-com:vml" xmlns:wp14="http://schemas.microsoft.com/office/word/2010/wordprocessingDrawing" xmlns:wp="http://schemas.openxmlformats.org/drawingml/2006/wordprocessingDrawing" xmlns:w10="urn:schemas-microsoft-com:office:word" xmlns:w="http://schemas.openxmlformats.org/wordprocessingml/2006/main" xmlns:w14="http://schemas.microsoft.com/office/word/2010/wordml" xmlns:w15="http://schemas.microsoft.com/office/word/2012/wordml" xmlns:w16cei="http://schemas.microsoft.com/office/word/2026/wordml/cei" xmlns:w16cex="http://schemas.microsoft.com/office/word/2018/wordml/cex" xmlns:w16cid="http://schemas.microsoft.com/office/word/2016/wordml/cid" xmlns:w16="http://schemas.microsoft.com/office/word/2018/wordml" xmlns:w16du="http://schemas.microsoft.com/office/word/2023/wordml/word16du" xmlns:w16sdtdh="http://schemas.microsoft.com/office/word/2020/wordml/sdtdatahash" xmlns:w16sdtfl="http://schemas.microsoft.com/office/word/2024/wordml/sdtformatlock" xmlns:w16se="http://schemas.microsoft.com/office/word/2015/wordml/symex" xmlns:wpg="http://schemas.microsoft.com/office/word/2010/wordprocessingGroup" xmlns:wpi="http://schemas.microsoft.com/office/word/2010/wordprocessingInk" xmlns:wne="http://schemas.microsoft.com/office/word/2006/wordml" xmlns:wps="http://schemas.microsoft.com/office/word/2010/wordprocessingShape" mc:Ignorable="w14 w15 w16se w16cid w16 w16cex w16sdtdh w16sdtfl w16du wp14">
   <w:p>
     <w:pPr>
       <w:pStyle w:val="En-tte"/>
@@ -19570,7 +19748,7 @@
 </file>
 
 <file path=word/header2.xml><?xml version="1.0" encoding="utf-8"?>
-<w:hdr xmlns:wpc="http://schemas.microsoft.com/office/word/2010/wordprocessingCanvas" xmlns:cx="http://schemas.microsoft.com/office/drawing/2014/chartex" xmlns:cx1="http://schemas.microsoft.com/office/drawing/2015/9/8/chartex" xmlns:cx2="http://schemas.microsoft.com/office/drawing/2015/10/21/chartex" xmlns:cx3="http://schemas.microsoft.com/office/drawing/2016/5/9/chartex" xmlns:cx4="http://schemas.microsoft.com/office/drawing/2016/5/10/chartex" xmlns:cx5="http://schemas.microsoft.com/office/drawing/2016/5/11/chartex" xmlns:cx6="http://schemas.microsoft.com/office/drawing/2016/5/12/chartex" xmlns:cx7="http://schemas.microsoft.com/office/drawing/2016/5/13/chartex" xmlns:cx8="http://schemas.microsoft.com/office/drawing/2016/5/14/chartex" xmlns:mc="http://schemas.openxmlformats.org/markup-compatibility/2006" xmlns:aink="http://schemas.microsoft.com/office/drawing/2016/ink" xmlns:am3d="http://schemas.microsoft.com/office/drawing/2017/model3d" xmlns:o="urn:schemas-microsoft-com:office:office" xmlns:oel="http://schemas.microsoft.com/office/2019/extlst" xmlns:r="http://schemas.openxmlformats.org/officeDocument/2006/relationships" xmlns:m="http://schemas.openxmlformats.org/officeDocument/2006/math" xmlns:v="urn:schemas-microsoft-com:vml" xmlns:wp14="http://schemas.microsoft.com/office/word/2010/wordprocessingDrawing" xmlns:wp="http://schemas.openxmlformats.org/drawingml/2006/wordprocessingDrawing" xmlns:w10="urn:schemas-microsoft-com:office:word" xmlns:w="http://schemas.openxmlformats.org/wordprocessingml/2006/main" xmlns:w14="http://schemas.microsoft.com/office/word/2010/wordml" xmlns:w15="http://schemas.microsoft.com/office/word/2012/wordml" xmlns:w16cex="http://schemas.microsoft.com/office/word/2018/wordml/cex" xmlns:w16cid="http://schemas.microsoft.com/office/word/2016/wordml/cid" xmlns:w16="http://schemas.microsoft.com/office/word/2018/wordml" xmlns:w16du="http://schemas.microsoft.com/office/word/2023/wordml/word16du" xmlns:w16sdtdh="http://schemas.microsoft.com/office/word/2020/wordml/sdtdatahash" xmlns:w16sdtfl="http://schemas.microsoft.com/office/word/2024/wordml/sdtformatlock" xmlns:w16se="http://schemas.microsoft.com/office/word/2015/wordml/symex" xmlns:wpg="http://schemas.microsoft.com/office/word/2010/wordprocessingGroup" xmlns:wpi="http://schemas.microsoft.com/office/word/2010/wordprocessingInk" xmlns:wne="http://schemas.microsoft.com/office/word/2006/wordml" xmlns:wps="http://schemas.microsoft.com/office/word/2010/wordprocessingShape" mc:Ignorable="w14 w15 w16se w16cid w16 w16cex w16sdtdh w16sdtfl w16du wp14">
+<w:hdr xmlns:wpc="http://schemas.microsoft.com/office/word/2010/wordprocessingCanvas" xmlns:cx="http://schemas.microsoft.com/office/drawing/2014/chartex" xmlns:cx1="http://schemas.microsoft.com/office/drawing/2015/9/8/chartex" xmlns:cx2="http://schemas.microsoft.com/office/drawing/2015/10/21/chartex" xmlns:cx3="http://schemas.microsoft.com/office/drawing/2016/5/9/chartex" xmlns:cx4="http://schemas.microsoft.com/office/drawing/2016/5/10/chartex" xmlns:cx5="http://schemas.microsoft.com/office/drawing/2016/5/11/chartex" xmlns:cx6="http://schemas.microsoft.com/office/drawing/2016/5/12/chartex" xmlns:cx7="http://schemas.microsoft.com/office/drawing/2016/5/13/chartex" xmlns:cx8="http://schemas.microsoft.com/office/drawing/2016/5/14/chartex" xmlns:mc="http://schemas.openxmlformats.org/markup-compatibility/2006" xmlns:aink="http://schemas.microsoft.com/office/drawing/2016/ink" xmlns:am3d="http://schemas.microsoft.com/office/drawing/2017/model3d" xmlns:o="urn:schemas-microsoft-com:office:office" xmlns:oel="http://schemas.microsoft.com/office/2019/extlst" xmlns:r="http://schemas.openxmlformats.org/officeDocument/2006/relationships" xmlns:m="http://schemas.openxmlformats.org/officeDocument/2006/math" xmlns:v="urn:schemas-microsoft-com:vml" xmlns:wp14="http://schemas.microsoft.com/office/word/2010/wordprocessingDrawing" xmlns:wp="http://schemas.openxmlformats.org/drawingml/2006/wordprocessingDrawing" xmlns:w10="urn:schemas-microsoft-com:office:word" xmlns:w="http://schemas.openxmlformats.org/wordprocessingml/2006/main" xmlns:w14="http://schemas.microsoft.com/office/word/2010/wordml" xmlns:w15="http://schemas.microsoft.com/office/word/2012/wordml" xmlns:w16cei="http://schemas.microsoft.com/office/word/2026/wordml/cei" xmlns:w16cex="http://schemas.microsoft.com/office/word/2018/wordml/cex" xmlns:w16cid="http://schemas.microsoft.com/office/word/2016/wordml/cid" xmlns:w16="http://schemas.microsoft.com/office/word/2018/wordml" xmlns:w16du="http://schemas.microsoft.com/office/word/2023/wordml/word16du" xmlns:w16sdtdh="http://schemas.microsoft.com/office/word/2020/wordml/sdtdatahash" xmlns:w16sdtfl="http://schemas.microsoft.com/office/word/2024/wordml/sdtformatlock" xmlns:w16se="http://schemas.microsoft.com/office/word/2015/wordml/symex" xmlns:wpg="http://schemas.microsoft.com/office/word/2010/wordprocessingGroup" xmlns:wpi="http://schemas.microsoft.com/office/word/2010/wordprocessingInk" xmlns:wne="http://schemas.microsoft.com/office/word/2006/wordml" xmlns:wps="http://schemas.microsoft.com/office/word/2010/wordprocessingShape" mc:Ignorable="w14 w15 w16se w16cid w16 w16cex w16sdtdh w16sdtfl w16du wp14">
   <w:p>
     <w:pPr>
       <w:pStyle w:val="En-tte"/>
@@ -19614,7 +19792,7 @@
 </file>
 
 <file path=word/header3.xml><?xml version="1.0" encoding="utf-8"?>
-<w:hdr xmlns:wpc="http://schemas.microsoft.com/office/word/2010/wordprocessingCanvas" xmlns:cx="http://schemas.microsoft.com/office/drawing/2014/chartex" xmlns:cx1="http://schemas.microsoft.com/office/drawing/2015/9/8/chartex" xmlns:cx2="http://schemas.microsoft.com/office/drawing/2015/10/21/chartex" xmlns:cx3="http://schemas.microsoft.com/office/drawing/2016/5/9/chartex" xmlns:cx4="http://schemas.microsoft.com/office/drawing/2016/5/10/chartex" xmlns:cx5="http://schemas.microsoft.com/office/drawing/2016/5/11/chartex" xmlns:cx6="http://schemas.microsoft.com/office/drawing/2016/5/12/chartex" xmlns:cx7="http://schemas.microsoft.com/office/drawing/2016/5/13/chartex" xmlns:cx8="http://schemas.microsoft.com/office/drawing/2016/5/14/chartex" xmlns:mc="http://schemas.openxmlformats.org/markup-compatibility/2006" xmlns:aink="http://schemas.microsoft.com/office/drawing/2016/ink" xmlns:am3d="http://schemas.microsoft.com/office/drawing/2017/model3d" xmlns:o="urn:schemas-microsoft-com:office:office" xmlns:oel="http://schemas.microsoft.com/office/2019/extlst" xmlns:r="http://schemas.openxmlformats.org/officeDocument/2006/relationships" xmlns:m="http://schemas.openxmlformats.org/officeDocument/2006/math" xmlns:v="urn:schemas-microsoft-com:vml" xmlns:wp14="http://schemas.microsoft.com/office/word/2010/wordprocessingDrawing" xmlns:wp="http://schemas.openxmlformats.org/drawingml/2006/wordprocessingDrawing" xmlns:w10="urn:schemas-microsoft-com:office:word" xmlns:w="http://schemas.openxmlformats.org/wordprocessingml/2006/main" xmlns:w14="http://schemas.microsoft.com/office/word/2010/wordml" xmlns:w15="http://schemas.microsoft.com/office/word/2012/wordml" xmlns:w16cex="http://schemas.microsoft.com/office/word/2018/wordml/cex" xmlns:w16cid="http://schemas.microsoft.com/office/word/2016/wordml/cid" xmlns:w16="http://schemas.microsoft.com/office/word/2018/wordml" xmlns:w16du="http://schemas.microsoft.com/office/word/2023/wordml/word16du" xmlns:w16sdtdh="http://schemas.microsoft.com/office/word/2020/wordml/sdtdatahash" xmlns:w16sdtfl="http://schemas.microsoft.com/office/word/2024/wordml/sdtformatlock" xmlns:w16se="http://schemas.microsoft.com/office/word/2015/wordml/symex" xmlns:wpg="http://schemas.microsoft.com/office/word/2010/wordprocessingGroup" xmlns:wpi="http://schemas.microsoft.com/office/word/2010/wordprocessingInk" xmlns:wne="http://schemas.microsoft.com/office/word/2006/wordml" xmlns:wps="http://schemas.microsoft.com/office/word/2010/wordprocessingShape" mc:Ignorable="w14 w15 w16se w16cid w16 w16cex w16sdtdh w16sdtfl w16du wp14">
+<w:hdr xmlns:wpc="http://schemas.microsoft.com/office/word/2010/wordprocessingCanvas" xmlns:cx="http://schemas.microsoft.com/office/drawing/2014/chartex" xmlns:cx1="http://schemas.microsoft.com/office/drawing/2015/9/8/chartex" xmlns:cx2="http://schemas.microsoft.com/office/drawing/2015/10/21/chartex" xmlns:cx3="http://schemas.microsoft.com/office/drawing/2016/5/9/chartex" xmlns:cx4="http://schemas.microsoft.com/office/drawing/2016/5/10/chartex" xmlns:cx5="http://schemas.microsoft.com/office/drawing/2016/5/11/chartex" xmlns:cx6="http://schemas.microsoft.com/office/drawing/2016/5/12/chartex" xmlns:cx7="http://schemas.microsoft.com/office/drawing/2016/5/13/chartex" xmlns:cx8="http://schemas.microsoft.com/office/drawing/2016/5/14/chartex" xmlns:mc="http://schemas.openxmlformats.org/markup-compatibility/2006" xmlns:aink="http://schemas.microsoft.com/office/drawing/2016/ink" xmlns:am3d="http://schemas.microsoft.com/office/drawing/2017/model3d" xmlns:o="urn:schemas-microsoft-com:office:office" xmlns:oel="http://schemas.microsoft.com/office/2019/extlst" xmlns:r="http://schemas.openxmlformats.org/officeDocument/2006/relationships" xmlns:m="http://schemas.openxmlformats.org/officeDocument/2006/math" xmlns:v="urn:schemas-microsoft-com:vml" xmlns:wp14="http://schemas.microsoft.com/office/word/2010/wordprocessingDrawing" xmlns:wp="http://schemas.openxmlformats.org/drawingml/2006/wordprocessingDrawing" xmlns:w10="urn:schemas-microsoft-com:office:word" xmlns:w="http://schemas.openxmlformats.org/wordprocessingml/2006/main" xmlns:w14="http://schemas.microsoft.com/office/word/2010/wordml" xmlns:w15="http://schemas.microsoft.com/office/word/2012/wordml" xmlns:w16cei="http://schemas.microsoft.com/office/word/2026/wordml/cei" xmlns:w16cex="http://schemas.microsoft.com/office/word/2018/wordml/cex" xmlns:w16cid="http://schemas.microsoft.com/office/word/2016/wordml/cid" xmlns:w16="http://schemas.microsoft.com/office/word/2018/wordml" xmlns:w16du="http://schemas.microsoft.com/office/word/2023/wordml/word16du" xmlns:w16sdtdh="http://schemas.microsoft.com/office/word/2020/wordml/sdtdatahash" xmlns:w16sdtfl="http://schemas.microsoft.com/office/word/2024/wordml/sdtformatlock" xmlns:w16se="http://schemas.microsoft.com/office/word/2015/wordml/symex" xmlns:wpg="http://schemas.microsoft.com/office/word/2010/wordprocessingGroup" xmlns:wpi="http://schemas.microsoft.com/office/word/2010/wordprocessingInk" xmlns:wne="http://schemas.microsoft.com/office/word/2006/wordml" xmlns:wps="http://schemas.microsoft.com/office/word/2010/wordprocessingShape" mc:Ignorable="w14 w15 w16se w16cid w16 w16cex w16sdtdh w16sdtfl w16du wp14">
   <w:p>
     <w:pPr>
       <w:pStyle w:val="En-tte"/>
@@ -19624,7 +19802,7 @@
 </file>
 
 <file path=word/numbering.xml><?xml version="1.0" encoding="utf-8"?>
-<w:numbering xmlns:wpc="http://schemas.microsoft.com/office/word/2010/wordprocessingCanvas" xmlns:cx="http://schemas.microsoft.com/office/drawing/2014/chartex" xmlns:cx1="http://schemas.microsoft.com/office/drawing/2015/9/8/chartex" xmlns:cx2="http://schemas.microsoft.com/office/drawing/2015/10/21/chartex" xmlns:cx3="http://schemas.microsoft.com/office/drawing/2016/5/9/chartex" xmlns:cx4="http://schemas.microsoft.com/office/drawing/2016/5/10/chartex" xmlns:cx5="http://schemas.microsoft.com/office/drawing/2016/5/11/chartex" xmlns:cx6="http://schemas.microsoft.com/office/drawing/2016/5/12/chartex" xmlns:cx7="http://schemas.microsoft.com/office/drawing/2016/5/13/chartex" xmlns:cx8="http://schemas.microsoft.com/office/drawing/2016/5/14/chartex" xmlns:mc="http://schemas.openxmlformats.org/markup-compatibility/2006" xmlns:aink="http://schemas.microsoft.com/office/drawing/2016/ink" xmlns:am3d="http://schemas.microsoft.com/office/drawing/2017/model3d" xmlns:o="urn:schemas-microsoft-com:office:office" xmlns:oel="http://schemas.microsoft.com/office/2019/extlst" xmlns:r="http://schemas.openxmlformats.org/officeDocument/2006/relationships" xmlns:m="http://schemas.openxmlformats.org/officeDocument/2006/math" xmlns:v="urn:schemas-microsoft-com:vml" xmlns:wp14="http://schemas.microsoft.com/office/word/2010/wordprocessingDrawing" xmlns:wp="http://schemas.openxmlformats.org/drawingml/2006/wordprocessingDrawing" xmlns:w10="urn:schemas-microsoft-com:office:word" xmlns:w="http://schemas.openxmlformats.org/wordprocessingml/2006/main" xmlns:w14="http://schemas.microsoft.com/office/word/2010/wordml" xmlns:w15="http://schemas.microsoft.com/office/word/2012/wordml" xmlns:w16cex="http://schemas.microsoft.com/office/word/2018/wordml/cex" xmlns:w16cid="http://schemas.microsoft.com/office/word/2016/wordml/cid" xmlns:w16="http://schemas.microsoft.com/office/word/2018/wordml" xmlns:w16du="http://schemas.microsoft.com/office/word/2023/wordml/word16du" xmlns:w16sdtdh="http://schemas.microsoft.com/office/word/2020/wordml/sdtdatahash" xmlns:w16sdtfl="http://schemas.microsoft.com/office/word/2024/wordml/sdtformatlock" xmlns:w16se="http://schemas.microsoft.com/office/word/2015/wordml/symex" xmlns:wpg="http://schemas.microsoft.com/office/word/2010/wordprocessingGroup" xmlns:wpi="http://schemas.microsoft.com/office/word/2010/wordprocessingInk" xmlns:wne="http://schemas.microsoft.com/office/word/2006/wordml" xmlns:wps="http://schemas.microsoft.com/office/word/2010/wordprocessingShape" mc:Ignorable="w14 w15 w16se w16cid w16 w16cex w16sdtdh w16sdtfl w16du wp14">
+<w:numbering xmlns:wpc="http://schemas.microsoft.com/office/word/2010/wordprocessingCanvas" xmlns:cx="http://schemas.microsoft.com/office/drawing/2014/chartex" xmlns:cx1="http://schemas.microsoft.com/office/drawing/2015/9/8/chartex" xmlns:cx2="http://schemas.microsoft.com/office/drawing/2015/10/21/chartex" xmlns:cx3="http://schemas.microsoft.com/office/drawing/2016/5/9/chartex" xmlns:cx4="http://schemas.microsoft.com/office/drawing/2016/5/10/chartex" xmlns:cx5="http://schemas.microsoft.com/office/drawing/2016/5/11/chartex" xmlns:cx6="http://schemas.microsoft.com/office/drawing/2016/5/12/chartex" xmlns:cx7="http://schemas.microsoft.com/office/drawing/2016/5/13/chartex" xmlns:cx8="http://schemas.microsoft.com/office/drawing/2016/5/14/chartex" xmlns:mc="http://schemas.openxmlformats.org/markup-compatibility/2006" xmlns:aink="http://schemas.microsoft.com/office/drawing/2016/ink" xmlns:am3d="http://schemas.microsoft.com/office/drawing/2017/model3d" xmlns:o="urn:schemas-microsoft-com:office:office" xmlns:oel="http://schemas.microsoft.com/office/2019/extlst" xmlns:r="http://schemas.openxmlformats.org/officeDocument/2006/relationships" xmlns:m="http://schemas.openxmlformats.org/officeDocument/2006/math" xmlns:v="urn:schemas-microsoft-com:vml" xmlns:wp14="http://schemas.microsoft.com/office/word/2010/wordprocessingDrawing" xmlns:wp="http://schemas.openxmlformats.org/drawingml/2006/wordprocessingDrawing" xmlns:w10="urn:schemas-microsoft-com:office:word" xmlns:w="http://schemas.openxmlformats.org/wordprocessingml/2006/main" xmlns:w14="http://schemas.microsoft.com/office/word/2010/wordml" xmlns:w15="http://schemas.microsoft.com/office/word/2012/wordml" xmlns:w16cei="http://schemas.microsoft.com/office/word/2026/wordml/cei" xmlns:w16cex="http://schemas.microsoft.com/office/word/2018/wordml/cex" xmlns:w16cid="http://schemas.microsoft.com/office/word/2016/wordml/cid" xmlns:w16="http://schemas.microsoft.com/office/word/2018/wordml" xmlns:w16du="http://schemas.microsoft.com/office/word/2023/wordml/word16du" xmlns:w16sdtdh="http://schemas.microsoft.com/office/word/2020/wordml/sdtdatahash" xmlns:w16sdtfl="http://schemas.microsoft.com/office/word/2024/wordml/sdtformatlock" xmlns:w16se="http://schemas.microsoft.com/office/word/2015/wordml/symex" xmlns:wpg="http://schemas.microsoft.com/office/word/2010/wordprocessingGroup" xmlns:wpi="http://schemas.microsoft.com/office/word/2010/wordprocessingInk" xmlns:wne="http://schemas.microsoft.com/office/word/2006/wordml" xmlns:wps="http://schemas.microsoft.com/office/word/2010/wordprocessingShape" mc:Ignorable="w14 w15 w16se w16cid w16 w16cex w16sdtdh w16sdtfl w16du wp14">
   <w:abstractNum w:abstractNumId="0" w15:restartNumberingAfterBreak="0">
     <w:nsid w:val="005C7D1D"/>
     <w:multiLevelType w:val="hybridMultilevel"/>
@@ -24526,6 +24704,7 @@
   <w:style w:type="character" w:default="1" w:styleId="Policepardfaut">
     <w:name w:val="Default Paragraph Font"/>
     <w:uiPriority w:val="1"/>
+    <w:semiHidden/>
     <w:unhideWhenUsed/>
   </w:style>
   <w:style w:type="table" w:default="1" w:styleId="TableauNormal">

</xml_diff>